<commit_message>
v0.4 - After Furkan revision - Submit again
</commit_message>
<xml_diff>
--- a/2026-Conf-FurkanT-AIM/ISCTurkiye26/revision/AIM_ISCTurkiye26_wNames.docx
+++ b/2026-Conf-FurkanT-AIM/ISCTurkiye26/revision/AIM_ISCTurkiye26_wNames.docx
@@ -260,13 +260,7 @@
       </w:r>
       <w:r>
         <w:lastRenderedPageBreak/>
-        <w:t>results of the feasibility tests. Finally, Section VI evaluates the findings</w:t>
-      </w:r>
-      <w:r>
-        <w:t xml:space="preserve"> and</w:t>
-      </w:r>
-      <w:r>
-        <w:t xml:space="preserve"> establishes the trajectory for future research.</w:t>
+        <w:t>results of the feasibility tests. Finally, Section VI evaluates the findings and establishes the trajectory for future research.</w:t>
       </w:r>
     </w:p>
     <w:p>
@@ -282,10 +276,16 @@
         <w:pStyle w:val="BodyText"/>
       </w:pPr>
       <w:r>
-        <w:t xml:space="preserve">Since 2024, AI agent identity management has rapidly progressed across academia and industry. Chan et al. examined agent identifiers, real-time monitoring, and activity logging to enhance visibility [16], while proposing a conceptual framework for assigning identities to AI instances [17]. Cryptographically, Rodriguez Garzon et al. [18] introduced self-sovereign identity using W3C Decentralized Identifiers and Verifiable Credentials integrated with LangChain and AutoGen, though highlighting the limitations of self-managed security in language models. AgentCrypt [19] introduced a four-layer homomorphic encryption framework for agent-to-agent communication. Industry developments include the OWASP Agentic AI Top 10 risk taxonomy [20], a NIST project on software and AI agent identity [21], and Microsoft's Agent Governance Toolkit featuring Ed25519 identities and the Inter-Agent Trust Protocol [22], though the latter still relies on traditional </w:t>
-      </w:r>
-      <w:r>
-        <w:t>PKI</w:t>
+        <w:t xml:space="preserve">Since 2024, AI agent identity management has rapidly progressed across academia and industry. Chan et al. examined agent identifiers, real-time monitoring, and activity logging to enhance visibility [16], while proposing a conceptual framework for assigning identities to AI instances [17]. Cryptographically, Rodriguez Garzon et al. [18] introduced self-sovereign identity using W3C Decentralized Identifiers and Verifiable Credentials integrated with LangChain and AutoGen, though highlighting the limitations of self-managed security in language models. AgentCrypt [19] introduced a four-layer homomorphic encryption framework for agent-to-agent communication. Industry developments include the OWASP Agentic AI Top 10 risk taxonomy [20], a NIST project on software and AI agent identity [21], and Microsoft's Agent Governance Toolkit featuring Ed25519 identities and the Inter-Agent Trust Protocol [22], though the latter still relies on </w:t>
+      </w:r>
+      <w:r>
+        <w:t>traditional</w:t>
+      </w:r>
+      <w:r>
+        <w:t xml:space="preserve"> </w:t>
+      </w:r>
+      <w:r>
+        <w:t>public key infrastructure</w:t>
       </w:r>
       <w:r>
         <w:t xml:space="preserve"> primitives.</w:t>
@@ -312,7 +312,10 @@
         <w:pStyle w:val="BodyText"/>
       </w:pPr>
       <w:r>
-        <w:t>Existing AI agent identity solutions, including decentralized identifiers [18], zero-knowledge virtual machines, and OAuth, provide deterministic verification but rely on centralized validity and revocation mechanisms. This centralization causes vulnerability to outages and scalability bottlenecks. Furthermore, cryptographic accumulators and probabilistic data structures remain unexplored for AI authentication despite the success of cuckoo filters in vehicular and medical networks. This study addresses this research gap.</w:t>
+        <w:t xml:space="preserve">Existing AI agent identity solutions, including decentralized identifiers [18], zero-knowledge virtual machines, and OAuth, provide deterministic verification but rely on centralized validity and revocation mechanisms. This centralization causes vulnerability to outages and scalability bottlenecks. Furthermore, cryptographic accumulators and probabilistic data structures remain unexplored for AI authentication despite the success of cuckoo filters in </w:t>
+      </w:r>
+      <w:r>
+        <w:t>vehicular and medical networks. This study addresses this research gap.</w:t>
       </w:r>
     </w:p>
     <w:p>
@@ -336,19 +339,7 @@
         <w:pStyle w:val="BodyText"/>
       </w:pPr>
       <w:r>
-        <w:t xml:space="preserve">A cryptographic accumulator represents a set A = {y₁, y₂, ..., yₙ} with a compact, fixed-size value z to enable efficient membership verification [24], [31]. Accumulators are broadly categorized into symmetric and asymmetric classes based on their underlying </w:t>
-      </w:r>
-      <w:r>
-        <w:t>cryptographic primitives [24]. Symmetric accumulators, such as Bloom filters [32] and cuckoo filters [15], store element fingerprints using k hash functions to support O(1) direct membership queries without witness generation</w:t>
-      </w:r>
-      <w:r>
-        <w:t xml:space="preserve"> </w:t>
-      </w:r>
-      <w:r>
-        <w:t>[33]. While computationally</w:t>
-      </w:r>
-      <w:r>
-        <w:t xml:space="preserve"> efficient, these structures can yield false positives. In contrast, asymmetric accumulators, including RSA-based schemes [7], utilize quasi-commutative hash functions and asymmetric primitives [7]. They evaluate membership deterministically via a function Ver(k, z, yᵢ, wᵢ) → {TRUE, FALSE} using per-element witness values w</w:t>
+        <w:t>A cryptographic accumulator represents a set A = {y₁, y₂, ..., yₙ} with a compact, fixed-size value z to enable efficient membership verification [24], [31]. Accumulators are broadly categorized into symmetric and asymmetric classes based on their underlying cryptographic primitives [24]. Symmetric accumulators, such as Bloom filters [32] and cuckoo filters [15], store element fingerprints using k hash functions to support O(1) direct membership queries without witness generation [33]. While computationally efficient, these structures can yield false positives. In contrast, asymmetric accumulators, including RSA-based schemes [7], utilize quasi-commutative hash functions and asymmetric primitives [7]. They evaluate membership deterministically via a function Ver(k, z, yᵢ, wᵢ) → {TRUE, FALSE} using per-element witness values w</w:t>
       </w:r>
       <w:r>
         <w:rPr>
@@ -436,27 +427,52 @@
         <w:pStyle w:val="BodyText"/>
       </w:pPr>
       <w:r>
-        <w:t>Fan et al. demonstrated that cuckoo filters achieve lower false positive rates and greater space efficiency than space-optimized Bloom filters for a given capacity [15]. Furthermore, whereas Bloom filters are static accumulators that require a complete rebuild to delete elements due to shared bit positions, cuckoo filters support dynamic element deletion [24</w:t>
-      </w:r>
-      <w:r>
-        <w:t>], [32].</w:t>
-      </w:r>
-    </w:p>
-    <w:p>
-      <w:pPr>
-        <w:pStyle w:val="BodyText"/>
+        <w:t>Fan et al. demonstrated that cuckoo filters achieve lower false positive rates and greater space efficiency than space-optimized Bloom filters for a given capacity [15]. Furthermore, whereas Bloom filters are static accumulators that require a complete rebuild to delete elements due to shared bit positions, cuckoo filters support dynamic element deletion [24], [32].</w:t>
+      </w:r>
+    </w:p>
+    <w:p>
+      <w:pPr>
+        <w:pStyle w:val="BodyText"/>
+      </w:pPr>
+      <w:r>
+        <w:t xml:space="preserve">The proposed multi-filter scheme inserts identical elements into k independent cuckoo filters using distinct hash functions. Requiring a positive match across all k filters yields a combined false positive rate </w:t>
+      </w:r>
+      <w:r>
+        <w:t>of:</w:t>
+      </w:r>
+    </w:p>
+    <w:p>
+      <w:pPr>
+        <w:pStyle w:val="equation"/>
         <w:rPr>
           <w:rFonts w:hint="eastAsia"/>
         </w:rPr>
       </w:pPr>
       <w:r>
-        <w:t>The proposed multi-filter scheme inserts identical elements into k independent cuckoo filters using distinct hash functions. Requiring a positive match across all k filters yields a combined false positive rate of</w:t>
-      </w:r>
-      <w:r>
+        <w:tab/>
+      </w:r>
+      <w:r>
+        <w:rPr>
+          <w:rFonts w:ascii="Times New Roman" w:hAnsi="Times New Roman" w:cs="Times New Roman"/>
+        </w:rPr>
+        <w:t>ε</w:t>
+      </w:r>
+      <w:r>
+        <w:rPr>
+          <w:rFonts w:ascii="Times New Roman" w:hAnsi="Times New Roman" w:cs="Times New Roman"/>
+          <w:vertAlign w:val="subscript"/>
+        </w:rPr>
+        <w:t>combined</w:t>
+      </w:r>
+      <w:r>
+        <w:rPr>
+          <w:rFonts w:ascii="Times New Roman" w:hAnsi="Times New Roman" w:cs="Times New Roman"/>
+        </w:rPr>
         <w:t xml:space="preserve"> ≈ ε</w:t>
       </w:r>
       <w:r>
         <w:rPr>
+          <w:rFonts w:ascii="Times New Roman" w:hAnsi="Times New Roman" w:cs="Times New Roman"/>
           <w:i/>
           <w:vertAlign w:val="superscript"/>
         </w:rPr>
@@ -464,6 +480,11 @@
       </w:r>
       <w:r>
         <w:tab/>
+      </w:r>
+      <w:r>
+        <w:rPr>
+          <w:rFonts w:ascii="Times New Roman" w:hAnsi="Times New Roman" w:cs="Times New Roman"/>
+        </w:rPr>
         <w:t>(2)</w:t>
       </w:r>
     </w:p>
@@ -471,14 +492,14 @@
       <w:pPr>
         <w:pStyle w:val="BodyText"/>
       </w:pPr>
-      <w:r>
-        <w:t>This multiplicative reduction rests on the assumption that the false positive events of the filters are independent and identically distributed (i.i.d</w:t>
-      </w:r>
-      <w:r>
-        <w:t>.); for</w:t>
-      </w:r>
-      <w:r>
-        <w:t xml:space="preserve"> independent events, the joint probability is equal to the product of their individual probabilities.</w:t>
+    </w:p>
+    <w:p>
+      <w:pPr>
+        <w:pStyle w:val="BodyText"/>
+      </w:pPr>
+      <w:r>
+        <w:lastRenderedPageBreak/>
+        <w:t>This multiplicative reduction rests on the assumption that the false positive events of the filters are independent and identically distributed (i.i.d.); for independent events, the joint probability is equal to the product of their individual probabilities.</w:t>
       </w:r>
     </w:p>
     <w:p>
@@ -486,7 +507,6 @@
         <w:pStyle w:val="Heading1"/>
       </w:pPr>
       <w:r>
-        <w:lastRenderedPageBreak/>
         <w:t>System Design</w:t>
       </w:r>
     </w:p>
@@ -578,25 +598,7 @@
         <w:pStyle w:val="BodyText"/>
       </w:pPr>
       <w:r>
-        <w:t xml:space="preserve">Each registered agent ID is inserted into k independent cuckoo filters using distinct hash </w:t>
-      </w:r>
-      <w:r>
-        <w:t>functions (H₁,</w:t>
-      </w:r>
-      <w:r>
-        <w:t xml:space="preserve"> H₂, ..., Hₖ), with verification determined by their combined output. This multi-filter architecture exponentially reduces the false positive rate to εᵏ, where ε represents the single-filter error rate. Crucially, unlike Bloom </w:t>
-      </w:r>
-      <w:r>
-        <w:t>filters</w:t>
-      </w:r>
-      <w:r>
-        <w:t xml:space="preserve"> </w:t>
-      </w:r>
-      <w:r>
-        <w:t>[32],</w:t>
-      </w:r>
-      <w:r>
-        <w:t xml:space="preserve"> cuckoo filters natively support element deletion [15], [24]. In agent revocation scenarios, this structural feature enables O(1) removal of a revoked agent's ID across all filters without requiring filter reconstruction.</w:t>
+        <w:t>Each registered agent ID is inserted into k independent cuckoo filters using distinct hash functions (H₁, H₂, ..., Hₖ), with verification determined by their combined output. This multi-filter architecture exponentially reduces the false positive rate to εᵏ, where ε represents the single-filter error rate. Crucially, unlike Bloom filters [32], cuckoo filters natively support element deletion [15], [24]. In agent revocation scenarios, this structural feature enables O(1) removal of a revoked agent's ID across all filters without requiring filter reconstruction.</w:t>
       </w:r>
     </w:p>
     <w:p>
@@ -668,10 +670,7 @@
         <w:t xml:space="preserve">AIM Client: </w:t>
       </w:r>
       <w:r>
-        <w:t xml:space="preserve">This is the client module embedded in each agent's runtime environment. It maintains local copies of </w:t>
-      </w:r>
-      <w:r>
-        <w:t>master filters and uses internal accumulators for rapid, offline verification. For critical operations or insufficient local data, the client queries the central AIM Server's Agent Registry for exact verification, mitigating the risks inherent to its probabilistic structure.</w:t>
+        <w:t>This is the client module embedded in each agent's runtime environment. It maintains local copies of master filters and uses internal accumulators for rapid, offline verification. For critical operations or insufficient local data, the client queries the central AIM Server's Agent Registry for exact verification, mitigating the risks inherent to its probabilistic structure.</w:t>
       </w:r>
     </w:p>
     <w:p>
@@ -792,7 +791,11 @@
         <w:t xml:space="preserve">Local Verification (Flow 1): </w:t>
       </w:r>
       <w:r>
-        <w:t>To authenticate its identity, the agent signs its request using its private key and appends its agent_id and public key to the request. The verifying agent's AIM Client first validates the signature against the provided public key to establish that the request originated from the key holder. Subsequently, it searches across all k local filters for the fingerprint of the identity and public key. An acceptance decision is generated if and only if the signature is valid and all filters cast an affirmative vote; a single negative vote from any filter suffices to reject the request. Because the workflow requires no network communication, registration and revocation status queries are completed without consulting a central authority.</w:t>
+        <w:t xml:space="preserve">To authenticate its identity, the agent signs its request using its private key and appends its agent_id and public key to the request. The verifying agent's AIM Client first validates the signature against the provided public key to establish that the request originated from the key holder. Subsequently, it searches across all k local filters for the fingerprint of the identity and public key. An acceptance decision is generated if and only if the signature is valid and all filters cast an affirmative vote; a single negative vote from any filter suffices to reject the request. Because the workflow requires no network communication, registration and </w:t>
+      </w:r>
+      <w:r>
+        <w:lastRenderedPageBreak/>
+        <w:t>revocation status queries are completed without consulting a central authority.</w:t>
       </w:r>
     </w:p>
     <w:p>
@@ -806,11 +809,7 @@
         <w:t xml:space="preserve">Central Fallback (Flow 2): </w:t>
       </w:r>
       <w:r>
-        <w:t xml:space="preserve">In critical operations (sensitive data access, highly privileged resources) or in situations where local verification may be insufficient, the AIM Client sends a VERIFY message to the central AIM Server. The AIM Server performs an exact check against the </w:t>
-      </w:r>
-      <w:r>
-        <w:lastRenderedPageBreak/>
-        <w:t>Agent Registry and completes the verification with a challenge-response. This fallback mechanism makes it possible to manage the risk inherent to the probabilistic structure and to ensure reliability in scenarios that require exact verification.</w:t>
+        <w:t>In critical operations (sensitive data access, highly privileged resources) or in situations where local verification may be insufficient, the AIM Client sends a VERIFY message to the central AIM Server. The AIM Server performs an exact check against the Agent Registry and completes the verification with a challenge-response. This fallback mechanism makes it possible to manage the risk inherent to the probabilistic structure and to ensure reliability in scenarios that require exact verification.</w:t>
       </w:r>
     </w:p>
     <w:p>
@@ -834,28 +833,19 @@
         <w:pStyle w:val="BodyText"/>
       </w:pPr>
       <w:r>
-        <w:t xml:space="preserve">The AIM Protocol is an application layer protocol that standardizes all communication between the server and clients. Operating over TCP sockets, each message consists of a JSON payload framed by a length prefix. The four primary operational messages are REGISTER, VERIFY, REVOKE, and SYNC; these are accompanied by SUBSCRIBE and INVALIDATE for synchronization subscriptions, CHALLENGE and RESPONSE for identity authentication, and ERROR for error reporting. During centralized authentication, the server generates a single-use nonce, and the agent proves possession of its private key by signing this nonce. Filter synchronization is achieved via a versioned pull mechanism: the client reports its current version, and the server transmits a state snapshot only when the client is out of date. </w:t>
-      </w:r>
-      <w:r>
-        <w:t>Following revocation operations, the server triggers an update by broadcasting an INVALIDATE message containing only the new version number to subscribed clients. Because this notification is delivered on a best-effort basis, the update is ultimately guaranteed by the client performing versioned pulls at</w:t>
+        <w:t xml:space="preserve">The AIM Protocol is an application layer protocol that standardizes all communication between the server and clients. Operating over TCP sockets, each message consists of a JSON payload framed by a length prefix. The four primary operational messages are REGISTER, VERIFY, REVOKE, and SYNC; these are accompanied by SUBSCRIBE and INVALIDATE for synchronization subscriptions, CHALLENGE and RESPONSE for identity authentication, and ERROR for error reporting. During centralized authentication, the server generates a single-use nonce, and the agent proves possession of its private key by signing this nonce. Filter synchronization is achieved via a versioned pull mechanism: the client reports its current version, and the server transmits a state snapshot only when the client is out of date. Following revocation operations, the server triggers an update by broadcasting an INVALIDATE message containing </w:t>
+      </w:r>
+      <w:r>
+        <w:t>only the new version number to subscribed clients.</w:t>
       </w:r>
       <w:r>
         <w:t xml:space="preserve"> </w:t>
       </w:r>
       <w:r>
-        <w:t>Δt</w:t>
-      </w:r>
-      <w:r>
-        <w:t xml:space="preserve"> </w:t>
-      </w:r>
-      <w:r>
-        <w:t>intervals. Denoting the duration of a synchronization round as δ, a revoked agent can pass local verification for a maximum of Δt + δ following revocation in the worst case. Upon successful delivery of the notification, this window reduces to approximately δ. This period extends as long as the client cannot reach the server, whereas operations reserved for centralized verification in Section IV-C remain unaffected by this window.</w:t>
-      </w:r>
-      <w:r>
-        <w:t xml:space="preserve"> </w:t>
-      </w:r>
-      <w:r>
-        <w:t>Finally, Transport Layer Security (TLS) serves as an optional security extension that can be integrated into the transport layer.</w:t>
+        <w:t>As this notification is best-effort, updates are guaranteed by versioned pulls every Δt; with δ denoting one synchronization round, a revoked agent can pass local verification for at most Δt + δ after revocation, or about δ when the notification arrives. This window grows while a client cannot reach the server, whereas operations reserved for central verification (Section IV-C) are unaffected. Finally</w:t>
+      </w:r>
+      <w:r>
+        <w:t>, Transport Layer Security (TLS) serves as an optional security extension that can be integrated into the transport layer.</w:t>
       </w:r>
     </w:p>
     <w:p>
@@ -882,28 +872,22 @@
         <w:pStyle w:val="BodyText"/>
       </w:pPr>
       <w:r>
-        <w:t>The proposed architecture was evaluated through independent feasibility and compliance tests structured around reproducibility, decoupled measurement, and baseline comparison.</w:t>
+        <w:t>The proposed architecture was evaluated through independent feasibility and compliance tests structured around reproducibility, decoupled measurement, and baseline comparison. To ensure reproducibility,</w:t>
       </w:r>
       <w:r>
         <w:t xml:space="preserve"> </w:t>
       </w:r>
       <w:r>
-        <w:t>To</w:t>
-      </w:r>
-      <w:r>
-        <w:t xml:space="preserve"> </w:t>
-      </w:r>
-      <w:r>
-        <w:t>ensure reproducibility, all operational parameters are logged. The filter experiments were repeated five times; in each iteration, the test executed with a distinct, fixed master seed (20260601–20260605) to reinitialize the filters, which were subsequently queried with 500,000 non-member keys. The reported values represent the average of these five repetitions, and the provided intervals indicate 95% confidence intervals derived from the Student's t-distribution.</w:t>
-      </w:r>
-      <w:r>
-        <w:t xml:space="preserve"> </w:t>
-      </w:r>
-      <w:r>
-        <w:t xml:space="preserve">Because joint false-positive events under strong fingerprints are unobservable within feasible query volumes, measurement </w:t>
-      </w:r>
-      <w:r>
-        <w:t>configurations were decoupled from operational settings, enabling metrics to be gathered on a degraded setup and structurally extrapolated. Identical workloads were also evaluated against a baseline centralized identity authority performing standard JWT verification with a centralized denylist, reflecting the tradeoff between immediate revocation and statelessness. Executed in-process on a single machine to isolate computational overhead from network latency, this baseline highlights relative scaling behavior rather than absolute performance metrics.</w:t>
+        <w:t xml:space="preserve">all operational parameters are logged, and each filter experiment is repeated five times with distinct master seeds (20260601–20260605), rebuilding the filters and querying them with 500,000 non-member keys; we report means with 95% confidence intervals </w:t>
+      </w:r>
+      <w:r>
+        <w:t>based on Student's t-distribution. Because joint false-positive events under strong fingerprints are unobservable within feasible query volumes, measurement configurations were decoupled from operational settings, enabling</w:t>
+      </w:r>
+      <w:r>
+        <w:t xml:space="preserve"> metrics to be gathered on a degraded setup and structurally extrapolated. Identical workloads were also evaluated against a baseline centralized identity authority performing standard JWT verification with a centralized denylist, reflecting the tradeoff between immediate revocation and statelessness. Executed in-process on a single machine to isolate computational overhead from network latency, this baseline highlights relative scaling behavio</w:t>
+      </w:r>
+      <w:r>
+        <w:t>r rather than absolute performance metrics.</w:t>
       </w:r>
     </w:p>
     <w:p>
@@ -920,13 +904,16 @@
         <w:t>∈</w:t>
       </w:r>
       <w:r>
-        <w:t xml:space="preserve"> {1, 3, 5}), fingerprint lengths, and agent population sizes (1,000 to 100,000). This population parameter was utilized exclusively for memory comparisons. By calculating the memory cost of filters sized for these identity counts, the memory ratio of a multi-filter to an equally protected single filter was found to be identical across all three population levels. Furthermore, the measurements presented in Figure 4 were obtained using 32,768-slot filters filled with synthetic keys until insertion was rejected, whereas the latency measurements in Figure 5 were evaluated using 1,000 synthetic agent identities registered to each system.</w:t>
+        <w:t xml:space="preserve"> {1, 3, 5}), fingerprint lengths, and agent population sizes (1,000 to 100,000). The population axis is used only in the memory comparison, where the memory ratio of the multi-filter design to an equally protective single filter is identical at all three sizes. Fig. 3 uses 32,768-slot filters filled with synthetic keys until insertion fails, and Fig. 4 uses 1,000 synthetic agent identities registered to each system.</w:t>
       </w:r>
       <w:r>
         <w:t xml:space="preserve"> </w:t>
       </w:r>
       <w:r>
-        <w:t>The operational setup uses a 32-bit fingerprint determined by the target false-positive rate, with bucket counts scaling alongside agent populations to manage addressing. Because credential content does not impact verification overhead, these parameters dictate system performance. Reported local latency includes AND-voting across k = 3 filters, while memory overhead is evaluated independently.</w:t>
+        <w:t>The operational setup uses a 32-bit fingerprint determined by the target false-positive rate, with bucket counts scaling alongside agent populations to manage</w:t>
+      </w:r>
+      <w:r>
+        <w:t xml:space="preserve"> addressing. Because credential content does not impact verification overhead, these parameters dictate system performance. Reported local latency includes AND-voting across k = 3 filters, while memory overhead is evaluated independently.</w:t>
       </w:r>
     </w:p>
     <w:p>
@@ -942,42 +929,18 @@
         <w:pStyle w:val="BodyText"/>
       </w:pPr>
       <w:r>
-        <w:t>The framework's claim that stacked filters exponentially reduce false positives relies on mutually independent error events across filters. Because non-independence breaks the multiplication rule and invalidates this core premise, experimentally testing independence is essential. To evaluate this property, three hashing schemes were tested, comprising AIM's independent-key design, a sequential-seed negative control, and a double-hashing method using two base hashes. System behavior was assessed using the ratio of observed to theoretical joint false positive rates, where values near 1 confirm multiplication rule validity, and the pairwise false positive φ-correlation coefficient, where values near 0 verify error independence</w:t>
-      </w:r>
-      <w:r>
-        <w:t xml:space="preserve">. Fig. </w:t>
-      </w:r>
-      <w:r>
-        <w:t>3</w:t>
-      </w:r>
-      <w:r>
-        <w:t xml:space="preserve"> presents the complete results.</w:t>
-      </w:r>
-    </w:p>
-    <w:p>
-      <w:pPr>
-        <w:pStyle w:val="BodyText"/>
-      </w:pPr>
-      <w:r>
-        <w:t>In AIM's independent setup and double hashing, empirical false positive rates align with theoretical predictions within measurement precision, a finding supported by 95\% confidence intervals. Specifically, the observed rates are 1.00 for the independent setup and 0.99 for double hashing, yielding mean pairwise φ-coefficients of +0.0004 and</w:t>
-      </w:r>
-      <w:r>
-        <w:t xml:space="preserve"> </w:t>
-      </w:r>
-      <w:r>
-        <w:t>-0.0003, respectively, which remain indistinguishable from zero.</w:t>
-      </w:r>
-      <w:r>
-        <w:t xml:space="preserve"> </w:t>
-      </w:r>
-      <w:r>
-        <w:t>Single-filter empirical rates also match theoretical expectations within a 10% margin for fingerprints up to 16 bits. Conversely, the consecutive seed shortcut degrades performance due to correlated filter errors; in this setup, it increases error rates over thirtyfold (measured at 30.95) and shifts the mean φ significantly positive to +0.414.</w:t>
-      </w:r>
-      <w:r>
-        <w:t xml:space="preserve"> </w:t>
-      </w:r>
-      <w:r>
-        <w:t>While three independent filters enhance protection seventy-five-fold relative to a single filter, shortcut filters provide only a two-fold gain, effectively reducing protection to single-filter levels despite full computational costs. This negative control demonstrates that system protection depends on filter independence rather than filter quantity.</w:t>
+        <w:t>The framework's claim that stacked filters exponentially reduce false positives relies on mutually independent error events across filters. Because non-independence breaks the multiplication rule and invalidates this core premise, experimentally testing independence is essential. To evaluate this property, three hashing schemes were tested, comprising AIM's independent-key design, a sequential-seed negative control, and a double-hashing method using two base hashes. System behavior was assessed using the ratio of observed to theoretical joint false positive rates, where values near 1 confirm multiplication rule validity, and the pairwise false positive φ-correlation coefficient, where values near 0 verify error independence. Fig. 3 presents the complete results.</w:t>
+      </w:r>
+    </w:p>
+    <w:p>
+      <w:pPr>
+        <w:pStyle w:val="BodyText"/>
+      </w:pPr>
+      <w:r>
+        <w:t>In AIM's independent setup and double hashing, empirical false positive rates align with theoretical predictions within measurement precision: the observed-to-predicted ratios are 1.00 [0.95, 1.05] and 0.99 [0.95, 1.03], respectively, and the mean pairwise φ-coefficients are +0.0004 [−0.0003, +0.0010] and −0.0003 [−0.0012, +0.0005] (95% confidence intervals), so all intervals contain the independence values of 1 and 0. Single-filter empirical rates also match theoretical expectations within a 10% margin for fingerprints up to 16 bits. Conversely, the consecutive seed shortcut degrades performance due to correlated filter errors; in this setup, it increases error rates over thirtyfold (ratio 30.95 [30.75, 31.15]) and shifts the mean φ significantly positive to +0.414 [0.410, 0.418]. While three independent filters enhance protection seventy-five-fold relative to a single filter, shortcut filters provide only a two-fold gain, effectively reducing protection to single-filter levels despite full computational costs. This negative control demonstrates that system</w:t>
+      </w:r>
+      <w:r>
+        <w:t xml:space="preserve"> protection depends on filter independence rather than filter quantity.</w:t>
       </w:r>
     </w:p>
     <w:p>
@@ -1032,50 +995,26 @@
         <w:pStyle w:val="figurecaption"/>
       </w:pPr>
       <w:r>
-        <w:t xml:space="preserve">Comparison of three hash configurations in terms of independence: (a) the ratio of the observed combined false positive rate to the independence prediction (k = 3; expected value 1), (b) the mean φ correlation between filter pairs (expected value 0). </w:t>
-      </w:r>
-      <w:r>
-        <w:t>Values represent the mean of five replicates; 95% confidence intervals are provided in the text.</w:t>
-      </w:r>
-    </w:p>
-    <w:p>
-      <w:pPr>
-        <w:pStyle w:val="BodyText"/>
-      </w:pPr>
-      <w:r>
-        <w:t>For longer fingerprints, direct empirical measurement is constrained by low event frequencies. Millions of operational queries yielded zero false positive events, as expected rates fell below observation thresholds. Consequently, operational combined rates are reported through extrapolation, whereas filter independence is validated in relaxed, measurable configurations.</w:t>
-      </w:r>
-    </w:p>
-    <w:p>
-      <w:pPr>
-        <w:pStyle w:val="BodyText"/>
-        <w:rPr>
-          <w:highlight w:val="yellow"/>
-        </w:rPr>
-      </w:pPr>
-      <w:r>
-        <w:t>The false positive rate depends not directly on the number of agents, but on the filter's occupancy rate (α, the ratio of occupied slots to total slots). Since a query is compared against an average of 2bα fingerprints across two buckets, the rate is approximately</w:t>
-      </w:r>
-      <w:r>
-        <w:t xml:space="preserve"> </w:t>
-      </w:r>
-      <w:r>
-        <w:t>ε ≈ 2bα/2ᶠ, demonstrating its dependence on occupancy; expression (1) represents the upper bound corresponding to a fully occupied filter (α</w:t>
-      </w:r>
-      <w:r>
-        <w:t xml:space="preserve"> </w:t>
-      </w:r>
-      <w:r>
-        <w:t>=</w:t>
-      </w:r>
-      <w:r>
-        <w:t xml:space="preserve"> </w:t>
-      </w:r>
-      <w:r>
-        <w:t>1). The measurements in Figure 4 were obtained by populating the filters until insertions were rejected.</w:t>
-      </w:r>
-      <w:r>
-        <w:t xml:space="preserve">  </w:t>
+        <w:t>Comparison of three hash configurations in terms of independence: (a) the ratio of the observed combined false positive rate to the independence prediction (k = 3; expected value 1), (b) the mean φ correlation between filter pairs (expected value 0). Values represent the mean of five replicates; 95% confidence intervals are provided in the text.</w:t>
+      </w:r>
+    </w:p>
+    <w:p>
+      <w:pPr>
+        <w:pStyle w:val="BodyText"/>
+      </w:pPr>
+      <w:r>
+        <w:t xml:space="preserve">For longer fingerprints, direct empirical measurement is constrained by low event frequencies. Millions of operational queries yielded zero false positive events, as expected rates fell below observation thresholds. Consequently, operational combined </w:t>
+      </w:r>
+      <w:r>
+        <w:t>rates are reported through extrapolation, whereas filter independence is validated in relaxed, measurable configurations.</w:t>
+      </w:r>
+    </w:p>
+    <w:p>
+      <w:pPr>
+        <w:pStyle w:val="BodyText"/>
+      </w:pPr>
+      <w:r>
+        <w:t xml:space="preserve">The false positive rate depends on the filter occupancy α (occupied/total slots) rather than directly on the number of agents: a query is compared with about 2bα stored fingerprints, so ε ≈ 2bα/2ᶠ, and (1) is its bound at α = 1. Fig. 3 was measured on filters filled until insertion failed (α ≈ 0.96; measured ε = 0.117, below the bound of 0.125), i.e., near the worst case. As bucket counts are rounded up to powers of two, filters sized for 1,000, 10,000, and 100,000 identities operate at α ≈ 0.49, 0.61, and 0.76, where ε is expected to decrease proportionally and εᵏ with αᵏ.  </w:t>
       </w:r>
     </w:p>
     <w:p>
@@ -1091,51 +1030,24 @@
         <w:pStyle w:val="BodyText"/>
       </w:pPr>
       <w:r>
-        <w:t xml:space="preserve">Two-stage verification risk management requires a low-cost local path, while central authority independence necessitates zero network round trips. This section evaluates each verification path by computational cost and round-trip count, as illustrated </w:t>
-      </w:r>
-      <w:r>
-        <w:t xml:space="preserve">in Fig. </w:t>
-      </w:r>
-      <w:r>
-        <w:t>4</w:t>
-      </w:r>
-      <w:r>
-        <w:t xml:space="preserve"> through</w:t>
-      </w:r>
-      <w:r>
-        <w:t xml:space="preserve"> baseline measurements and total latency projections.</w:t>
-      </w:r>
-    </w:p>
-    <w:p>
-      <w:pPr>
-        <w:pStyle w:val="BodyText"/>
-      </w:pPr>
-      <w:r>
-        <w:t xml:space="preserve">Fig. </w:t>
-      </w:r>
-      <w:r>
-        <w:t>4</w:t>
-      </w:r>
-      <w:r>
-        <w:t>(a)</w:t>
-      </w:r>
-      <w:r>
-        <w:t xml:space="preserve"> details baseline performance.</w:t>
-      </w:r>
-      <w:r>
-        <w:t xml:space="preserve"> </w:t>
-      </w:r>
-      <w:r>
-        <w:t>Each verification run was measured 10,000 times following 200 warm-up calls that were excluded from the analysis; the bars in Figure 5(a) represent the average of these measurements. Because the evaluation was conducted in a single run, the distribution is summarized by two values rather than a confidence interval: the median and the 95th percentile. These values are 6.3 and 7.8 µs for local AIM, 9.1 and 10.0 µs for JWT, 114 and 194 µs for centralized AIM, and 121 and 197 µs for centralized AIM with TLS.</w:t>
-      </w:r>
-      <w:r>
-        <w:t xml:space="preserve"> </w:t>
-      </w:r>
-      <w:r>
-        <w:t xml:space="preserve">Local AIM and JWT execute in-process, isolating CPU costs for signature verification and revocation from socket overhead. Conversely, central AIM operates over an active network, incurring transport overhead and making network round trips the primary comparative metric. Under this metric, verification requires zero round trips for both JWT and local AIM, compared to two for central AIM. Between the two local approaches, JWT requires a round trip per user for </w:t>
-      </w:r>
-      <w:r>
-        <w:t>token issuance, while local AIM only incurs round trips during periodic filter updates across all authorized users, resulting in significantly fewer total trips. Central AIM employs a challenge-response authentication scheme to protect the secret key from network exposure. This two-round-trip latency is acceptable because central AIM functions as an infrequent fallback rather than a hot execution path.</w:t>
+        <w:t>Two-stage verification risk management requires a low-cost local path, while central authority independence necessitates zero network round trips. This section evaluates each verification path by computational cost and round-trip count, as illustrated in Fig. 4 through baseline measurements and total latency projections.</w:t>
+      </w:r>
+    </w:p>
+    <w:p>
+      <w:pPr>
+        <w:pStyle w:val="BodyText"/>
+      </w:pPr>
+      <w:r>
+        <w:t>Fig. 4(a) details baseline performance</w:t>
+      </w:r>
+      <w:r>
+        <w:t xml:space="preserve">. </w:t>
+      </w:r>
+      <w:r>
+        <w:t xml:space="preserve">Each path was timed 10,000 times after 200 unmeasured warm-up calls, and the bars show the means; since this was a single run, we report the median and 95th percentile instead of confidence intervals: 6.3/7.8 µs (local AIM), 9.1/10.0 µs (JWT), 114/194 µs (central AIM), and 121/197 µs (central AIM with TLS). Local AIM and JWT execute in-process, isolating CPU costs for signature verification and revocation from socket overhead. Conversely, central AIM operates over an active network, incurring transport overhead and making network round trips the primary comparative metric. Under this metric, verification requires zero round trips for both JWT and local AIM, compared to two for central AIM. Between the two local approaches, JWT requires a round trip per user for token issuance, while local AIM only incurs round trips during periodic filter updates across all authorized users, resulting in </w:t>
+      </w:r>
+      <w:r>
+        <w:t>significantly fewer total trips. Central AIM employs a challenge-response authentication scheme to protect the secret key from network exposure. This two-round-trip latency is acceptable because central AIM functions as an infrequent fallback rather than a hot execution path.</w:t>
       </w:r>
     </w:p>
     <w:p>
@@ -1197,16 +1109,7 @@
         <w:pStyle w:val="BodyText"/>
       </w:pPr>
       <w:r>
-        <w:t xml:space="preserve">Fig. </w:t>
-      </w:r>
-      <w:r>
-        <w:t>4</w:t>
-      </w:r>
-      <w:r>
-        <w:t>(b</w:t>
-      </w:r>
-      <w:r>
-        <w:t>) models latency by adding measured baseline costs to the product of round trips and assumed round-trip time (RTT), assuming linear accumulation without significant bandwidth or packet loss impacts. At a transcontinental 50 ms RTT, microsecond-level local verification remains constant, whereas single- and two-round-trip paths reach tens and hundreds of milliseconds, respectively, causing RTT to dominate computational baseline differences. Furthermore, persistent connections render per-verification TLS overhead negligible by incurring handshake costs only once, yielding nearly identical results for central paths with or without TLS.</w:t>
+        <w:t>Fig. 4(b) models latency by adding measured baseline costs to the product of round trips and assumed round-trip time (RTT), assuming linear accumulation without significant bandwidth or packet loss impacts. At a transcontinental 50 ms RTT, microsecond-level local verification remains constant, whereas single- and two-round-trip paths reach tens and hundreds of milliseconds, respectively, causing RTT to dominate computational baseline differences. Furthermore, persistent connections render per-verification TLS overhead negligible by incurring handshake costs only once, yielding nearly identical results for central paths with or without TLS.</w:t>
       </w:r>
     </w:p>
     <w:p>
@@ -1222,121 +1125,50 @@
         <w:pStyle w:val="BodyText"/>
       </w:pPr>
       <w:r>
-        <w:t>Although empirical results validate the framework, running three parallel filters incurs a 20% memory overhead relative to an equivalent single filter for short and medium fingerprints. Consequently, the architecture is motivated by decentralized protection and graceful degradation rather than spatial efficiency. Because filter copies and their hash keys are distributed to clients, an attacker who compromises a single copy can perform an offline search for an identity that passes through all filters. Since the success probability of each attempt is</w:t>
+        <w:t>Although empirical results validate the framework, running three parallel filters incurs a 20% memory overhead relative to an equivalent single filter for short and medium fingerprints. Consequently, the architecture is motivated by decentralized protection and graceful degradation rather than spatial efficiency. Each filter an adversary neutralizes raises attack success by about one order of magnitude in the measurement setup (f = 6) and by 2²⁹ in the operational setting (f = 32); unlike single-filter designs, where one breach is fatal, an adversary must defeat every independent filter. Since filter copies and hash keys are distributed to clients, an attacker holding a copy can search offline for an identity that passes all filters, needing 1/εᵏ attempts on average: about 2²⁹ for a single 32-bit filter versus 2⁸⁷ for k = 3 (b = 4, full occupancy).</w:t>
+      </w:r>
+    </w:p>
+    <w:p>
+      <w:pPr>
+        <w:pStyle w:val="Heading1"/>
+      </w:pPr>
+      <w:r>
+        <w:t>Discussion and Conclusion</w:t>
+      </w:r>
+    </w:p>
+    <w:p>
+      <w:pPr>
+        <w:pStyle w:val="BodyText"/>
+      </w:pPr>
+      <w:r>
+        <w:t>The rapid growth of LLM-driven autonomous agents exposes critical authentication vulnerabilities, causing</w:t>
+      </w:r>
+      <w:r>
+        <w:t xml:space="preserve"> organizations to fail compliance audits when unable to distinguish agent from human activity [5], [6]. Traditional protocols like API keys, OAuth, and JWT lack standardized agent-to-agent support and create centralized single points of failure. Although cryptographic accumulators offer compact </w:t>
+      </w:r>
+      <w:r>
+        <w:lastRenderedPageBreak/>
+        <w:t xml:space="preserve">set-membership proofs, they remain unused in AI authentication. We address this gap by proposing the Agent Identity Manager (AIM). By integrating a multi-cuckoo filter architecture, two-stage verification, and distributed filter replicas, AIM reduces false-positive rates to εᵏ, mitigates centralized revocation dependencies, and enables local verification without network round-trips. </w:t>
+      </w:r>
+    </w:p>
+    <w:p>
+      <w:pPr>
+        <w:pStyle w:val="BodyText"/>
+      </w:pPr>
+      <w:r>
+        <w:t xml:space="preserve">Empirical testing reveals inherent structural trade-offs within the architecture. While multi-filtering adds overhead for short fingerprints relative to single filters, deploying multiple short filters increases the overall reliability of the system by eliminating a single point of failure. AIM prioritizes resilience against offline exhaustive searches and graceful degradation over space efficiency. As shown in Section V-D, the expected number of </w:t>
+      </w:r>
+      <w:r>
+        <w:t>offline search trials for a 32-bit fingerprint is 2²⁹ for a single filter, whereas it is 2⁸⁷ for k = 3 filters. Additionally,</w:t>
       </w:r>
       <w:r>
         <w:t xml:space="preserve"> </w:t>
       </w:r>
       <w:r>
-        <w:t>εᵏ</w:t>
-      </w:r>
-      <w:r>
-        <w:t xml:space="preserve">, the expected number of required attempts is </w:t>
-      </w:r>
-      <w:r>
-        <w:t>1/εᵏ</w:t>
-      </w:r>
-      <w:r>
-        <w:t xml:space="preserve">. Therefore, each compromised filter increases attack success by approximately one order of magnitude in the measurement setup (f = 6) and by a factor of </w:t>
-      </w:r>
-      <w:r>
-        <w:t>2²⁹</w:t>
-      </w:r>
-      <w:r>
-        <w:t xml:space="preserve"> per filter in the operational setting (f = 32).</w:t>
-      </w:r>
-    </w:p>
-    <w:p>
-      <w:pPr>
-        <w:pStyle w:val="BodyText"/>
-      </w:pPr>
-      <w:r>
-        <w:t xml:space="preserve">Unlike single-filter designs where a single breach causes total system failure, this multi-filter approach forces an adversary to neutralize every independent filter simultaneously. Assuming full occupancy in the operational setting (f = 32, b = 4), a single filter yields </w:t>
-      </w:r>
-      <w:r>
-        <w:t>ε = 2⁻²⁹</w:t>
-      </w:r>
-      <w:r>
-        <w:t xml:space="preserve">, which allows an offline search to succeed in approximately </w:t>
-      </w:r>
-      <w:r>
-        <w:t>2²⁹</w:t>
-      </w:r>
-      <w:r>
-        <w:t xml:space="preserve"> </w:t>
-      </w:r>
-      <w:r>
-        <w:lastRenderedPageBreak/>
-        <w:t xml:space="preserve">attempts. In contrast, deploying k = 3 filters increases the expected number of attempts to </w:t>
-      </w:r>
-      <w:r>
-        <w:t>2⁸⁷</w:t>
-      </w:r>
-      <w:r>
-        <w:t>.</w:t>
-      </w:r>
-      <w:r>
-        <w:t xml:space="preserve"> </w:t>
-      </w:r>
-    </w:p>
-    <w:p>
-      <w:pPr>
-        <w:pStyle w:val="Heading1"/>
-      </w:pPr>
-      <w:r>
-        <w:t>Discussion and Conclusion</w:t>
-      </w:r>
-    </w:p>
-    <w:p>
-      <w:pPr>
-        <w:pStyle w:val="BodyText"/>
-      </w:pPr>
-      <w:r>
-        <w:t xml:space="preserve">The rapid growth of </w:t>
-      </w:r>
-      <w:r>
-        <w:t>LLM-driven autonomous agents exposes critical authentication vulnerabilities, causing organizations to fail compliance audits when unable to distinguish agent from human activity [5], [6]. Traditional protocols like API keys, OAuth, and JWT lack standardized agent-to-agent support and create centralized single points of failure. Although cryptographic accumulators offer compact set-membership proofs, they remain unused in AI authentication. We address this gap by proposing the Agent Identity Manager (AIM). By integrating a multi-cuckoo filter architecture, two-stage verification, and distributed filter replicas, AIM reduces false-positive rates to εᵏ, mitigates centralized revocation dependencies, and enables local verification without network round-trips.</w:t>
-      </w:r>
-      <w:r>
-        <w:t xml:space="preserve"> </w:t>
-      </w:r>
-    </w:p>
-    <w:p>
-      <w:pPr>
-        <w:pStyle w:val="BodyText"/>
-      </w:pPr>
-      <w:r>
-        <w:t>Empirical testing reveals inherent structural trade-offs within the architecture. While multi-filtering adds overhead for short fingerprints relative to single filters, deploying multiple short filters increases the overall reliability of the system by eliminating a single point of failure. AIM prioritizes resilience against offline exhaustive searches and graceful degradation over space efficiency.</w:t>
-      </w:r>
-      <w:r>
-        <w:t xml:space="preserve"> </w:t>
-      </w:r>
-      <w:r>
-        <w:t>As shown in Section V-D, the expected number of offline search trials for a 32-bit fingerprint is 2²⁹ for a single filter, whereas it is 2⁸⁷ for k = 3 filters.</w:t>
-      </w:r>
-      <w:r>
-        <w:t xml:space="preserve"> </w:t>
-      </w:r>
-      <w:r>
-        <w:t>Additionally,</w:t>
-      </w:r>
-      <w:r>
-        <w:t xml:space="preserve"> </w:t>
-      </w:r>
-      <w:r>
-        <w:t>two</w:t>
-      </w:r>
-      <w:r>
-        <w:t xml:space="preserve"> </w:t>
-      </w:r>
-      <w:r>
-        <w:t>round challenge</w:t>
-      </w:r>
-      <w:r>
-        <w:t xml:space="preserve"> </w:t>
-      </w:r>
-      <w:r>
-        <w:t>response verification is costlier than single-round token verification, though it remains acceptable as an infrequent fallback mechanism. Because initial evaluations focused on identity primitives rather than live autonomous agents, measuring runtime overhead within complete workflows remains an objective for future research.</w:t>
+        <w:t>two-round challenge-response verification is costlier than single-round token verification, though it remains acceptable as an infrequent fallback mechanism. Because initial evaluations focused on identity primitives rather than live autonomous agents, measuring runtime overhead within complete workflows remains</w:t>
+      </w:r>
+      <w:r>
+        <w:t xml:space="preserve"> an objective for future research.</w:t>
       </w:r>
     </w:p>
     <w:p>
@@ -1456,7 +1288,10 @@
         <w:pStyle w:val="references"/>
       </w:pPr>
       <w:r>
-        <w:t>İ. K. Çekiş, A. Toros, V. Yiğit, and İ. Özçelik, “Edge authentication using a cryptographic accumulator,” in Proc. 2025 9th Int. Symp. Multidisciplinary Studies and Innovative Technologies (ISMSIT), IEEE, 2025, pp. 1–5.</w:t>
+        <w:t xml:space="preserve">İ. K. Çekiş, A. Toros, V. Yiğit, and İ. Özçelik, “Edge authentication using a cryptographic accumulator,” in Proc. 2025 9th Int. Symp. </w:t>
+      </w:r>
+      <w:r>
+        <w:t>Multidisciplinary Studies and Innovative Technologies (ISMSIT), IEEE, 2025, pp. 1–5.</w:t>
       </w:r>
     </w:p>
     <w:p>
@@ -1600,10 +1435,7 @@
         <w:pStyle w:val="references"/>
       </w:pPr>
       <w:r>
-        <w:t xml:space="preserve">N. Fazio and A. Nicolosi, “Cryptographic accumulators: Definitions, constructions and applications,” Technical Report, New York </w:t>
-      </w:r>
-      <w:r>
-        <w:t>University, 2002.</w:t>
+        <w:t>N. Fazio and A. Nicolosi, “Cryptographic accumulators: Definitions, constructions and applications,” Technical Report, New York University, 2002.</w:t>
       </w:r>
     </w:p>
     <w:p>
@@ -4201,25 +4033,6 @@
 </file>
 
 <file path=customXml/item1.xml><?xml version="1.0" encoding="utf-8"?>
-<?mso-contentType ?>
-<FormTemplates xmlns="http://schemas.microsoft.com/sharepoint/v3/contenttype/forms">
-  <Display>DocumentLibraryForm</Display>
-  <Edit>DocumentLibraryForm</Edit>
-  <New>DocumentLibraryForm</New>
-</FormTemplates>
-</file>
-
-<file path=customXml/item2.xml><?xml version="1.0" encoding="utf-8"?>
-<b:Sources xmlns:b="http://schemas.openxmlformats.org/officeDocument/2006/bibliography" xmlns="http://schemas.openxmlformats.org/officeDocument/2006/bibliography" SelectedStyle="\APA.XSL" StyleName="APA"/>
-</file>
-
-<file path=customXml/item3.xml><?xml version="1.0" encoding="utf-8"?>
-<p:properties xmlns:p="http://schemas.microsoft.com/office/2006/metadata/properties" xmlns:xsi="http://www.w3.org/2001/XMLSchema-instance" xmlns:pc="http://schemas.microsoft.com/office/infopath/2007/PartnerControls">
-  <documentManagement/>
-</p:properties>
-</file>
-
-<file path=customXml/item4.xml><?xml version="1.0" encoding="utf-8"?>
 <ct:contentTypeSchema xmlns:ct="http://schemas.microsoft.com/office/2006/metadata/contentType" xmlns:ma="http://schemas.microsoft.com/office/2006/metadata/properties/metaAttributes" ct:_="" ma:_="" ma:contentTypeName="Document" ma:contentTypeID="0x010100D58DCA943182484ABD609B822AD9CE1F" ma:contentTypeVersion="7" ma:contentTypeDescription="Create a new document." ma:contentTypeScope="" ma:versionID="c875fdae04c8d039d0fd5f1f4d5d2660">
   <xsd:schema xmlns:xsd="http://www.w3.org/2001/XMLSchema" xmlns:xs="http://www.w3.org/2001/XMLSchema" xmlns:p="http://schemas.microsoft.com/office/2006/metadata/properties" xmlns:ns2="ea978dfc-ae2d-4f64-9229-3a774405c65e" targetNamespace="http://schemas.microsoft.com/office/2006/metadata/properties" ma:root="true" ma:fieldsID="4146eff3bd70ff6fc00094847c141234" ns2:_="">
     <xsd:import namespace="ea978dfc-ae2d-4f64-9229-3a774405c65e"/>
@@ -4381,32 +4194,26 @@
 </ct:contentTypeSchema>
 </file>
 
-<file path=customXml/itemProps1.xml><?xml version="1.0" encoding="utf-8"?>
-<ds:datastoreItem xmlns:ds="http://schemas.openxmlformats.org/officeDocument/2006/customXml" ds:itemID="{C22B4DB9-CCDF-4EDD-B9D7-BCCE29668D29}">
-  <ds:schemaRefs>
-    <ds:schemaRef ds:uri="http://schemas.microsoft.com/sharepoint/v3/contenttype/forms"/>
-  </ds:schemaRefs>
-</ds:datastoreItem>
+<file path=customXml/item2.xml><?xml version="1.0" encoding="utf-8"?>
+<p:properties xmlns:p="http://schemas.microsoft.com/office/2006/metadata/properties" xmlns:xsi="http://www.w3.org/2001/XMLSchema-instance" xmlns:pc="http://schemas.microsoft.com/office/infopath/2007/PartnerControls">
+  <documentManagement/>
+</p:properties>
 </file>
 
-<file path=customXml/itemProps2.xml><?xml version="1.0" encoding="utf-8"?>
-<ds:datastoreItem xmlns:ds="http://schemas.openxmlformats.org/officeDocument/2006/customXml" ds:itemID="{BB2A3971-AEE6-45BE-B7EE-D975353059D9}">
-  <ds:schemaRefs>
-    <ds:schemaRef ds:uri="http://schemas.openxmlformats.org/officeDocument/2006/bibliography"/>
-  </ds:schemaRefs>
-</ds:datastoreItem>
+<file path=customXml/item3.xml><?xml version="1.0" encoding="utf-8"?>
+<b:Sources xmlns:b="http://schemas.openxmlformats.org/officeDocument/2006/bibliography" xmlns="http://schemas.openxmlformats.org/officeDocument/2006/bibliography" SelectedStyle="\APA.XSL" StyleName="APA"/>
 </file>
 
-<file path=customXml/itemProps3.xml><?xml version="1.0" encoding="utf-8"?>
-<ds:datastoreItem xmlns:ds="http://schemas.openxmlformats.org/officeDocument/2006/customXml" ds:itemID="{4525A69F-56E4-4AE4-B12D-A1474BE681BE}">
-  <ds:schemaRefs>
-    <ds:schemaRef ds:uri="http://schemas.microsoft.com/office/2006/metadata/properties"/>
-    <ds:schemaRef ds:uri="http://schemas.microsoft.com/office/infopath/2007/PartnerControls"/>
-  </ds:schemaRefs>
-</ds:datastoreItem>
+<file path=customXml/item4.xml><?xml version="1.0" encoding="utf-8"?>
+<?mso-contentType ?>
+<FormTemplates xmlns="http://schemas.microsoft.com/sharepoint/v3/contenttype/forms">
+  <Display>DocumentLibraryForm</Display>
+  <Edit>DocumentLibraryForm</Edit>
+  <New>DocumentLibraryForm</New>
+</FormTemplates>
 </file>
 
-<file path=customXml/itemProps4.xml><?xml version="1.0" encoding="utf-8"?>
+<file path=customXml/itemProps1.xml><?xml version="1.0" encoding="utf-8"?>
 <ds:datastoreItem xmlns:ds="http://schemas.openxmlformats.org/officeDocument/2006/customXml" ds:itemID="{0C585407-F0D0-45A7-888D-46FA01810BB5}">
   <ds:schemaRefs>
     <ds:schemaRef ds:uri="http://schemas.microsoft.com/office/2006/metadata/contentType"/>
@@ -4422,4 +4229,29 @@
     <ds:schemaRef ds:uri="http://schemas.microsoft.com/internal/obd"/>
   </ds:schemaRefs>
 </ds:datastoreItem>
+</file>
+
+<file path=customXml/itemProps2.xml><?xml version="1.0" encoding="utf-8"?>
+<ds:datastoreItem xmlns:ds="http://schemas.openxmlformats.org/officeDocument/2006/customXml" ds:itemID="{4525A69F-56E4-4AE4-B12D-A1474BE681BE}">
+  <ds:schemaRefs>
+    <ds:schemaRef ds:uri="http://schemas.microsoft.com/office/2006/metadata/properties"/>
+    <ds:schemaRef ds:uri="http://schemas.microsoft.com/office/infopath/2007/PartnerControls"/>
+  </ds:schemaRefs>
+</ds:datastoreItem>
+</file>
+
+<file path=customXml/itemProps3.xml><?xml version="1.0" encoding="utf-8"?>
+<ds:datastoreItem xmlns:ds="http://schemas.openxmlformats.org/officeDocument/2006/customXml" ds:itemID="{BB2A3971-AEE6-45BE-B7EE-D975353059D9}">
+  <ds:schemaRefs>
+    <ds:schemaRef ds:uri="http://schemas.openxmlformats.org/officeDocument/2006/bibliography"/>
+  </ds:schemaRefs>
+</ds:datastoreItem>
+</file>
+
+<file path=customXml/itemProps4.xml><?xml version="1.0" encoding="utf-8"?>
+<ds:datastoreItem xmlns:ds="http://schemas.openxmlformats.org/officeDocument/2006/customXml" ds:itemID="{C22B4DB9-CCDF-4EDD-B9D7-BCCE29668D29}">
+  <ds:schemaRefs>
+    <ds:schemaRef ds:uri="http://schemas.microsoft.com/sharepoint/v3/contenttype/forms"/>
+  </ds:schemaRefs>
+</ds:datastoreItem>
 </file>
</xml_diff>